<commit_message>
Correct vendor name to Exceed Technologies on the Tupelo brief
Patches the two prepared_for strings in word/document.xml (cover page and
scope paragraph) in place, leaving the roster data untouched. The other
Exceed Technologies occurrences in the packet are the host venue's own name
and were already correct.
</commit_message>
<xml_diff>
--- a/docs/audits/tupelo-2026-08/MCTV_FieldAudit_Tupelo.docx
+++ b/docs/audits/tupelo-2026-08/MCTV_FieldAudit_Tupelo.docx
@@ -99,7 +99,7 @@
                 <w:color w:val="FFFFFF"/>
                 <w:sz w:val="48"/>
               </w:rPr>
-              <w:t>XCEED TECHNOLOGIES</w:t>
+              <w:t>EXCEED TECHNOLOGIES</w:t>
             </w:r>
           </w:p>
           <w:p>
@@ -305,7 +305,7 @@
           <w:color w:val="333333"/>
           <w:sz w:val="21"/>
         </w:rPr>
-        <w:t>Xceed Technologies is auditing every MCTV screen in the Tupelo market. This document lists each screen, where it is, who to ask for, and the license number of the Raspberry Pi driving it. A companion spreadsheet is where findings get recorded, and a companion label sheet carries one printed label per license.</w:t>
+        <w:t>Exceed Technologies is auditing every MCTV screen in the Tupelo market. This document lists each screen, where it is, who to ask for, and the license number of the Raspberry Pi driving it. A companion spreadsheet is where findings get recorded, and a companion label sheet carries one printed label per license.</w:t>
       </w:r>
     </w:p>
     <w:tbl>

</xml_diff>